<commit_message>
Update project files, fix bugs, and refine visuals and game mechanics
</commit_message>
<xml_diff>
--- a/ImprovementsList.docx
+++ b/ImprovementsList.docx
@@ -462,6 +462,40 @@
           <w:iCs/>
         </w:rPr>
         <w:t xml:space="preserve">Mechanics: </w:t>
+      </w:r>
+    </w:p>
+    <w:p>
+      <w:pPr>
+        <w:pStyle w:val="ListParagraph"/>
+        <w:numPr>
+          <w:ilvl w:val="0"/>
+          <w:numId w:val="1"/>
+        </w:numPr>
+      </w:pPr>
+      <w:r>
+        <w:t>Bug</w:t>
+      </w:r>
+    </w:p>
+    <w:p>
+      <w:pPr>
+        <w:pStyle w:val="ListParagraph"/>
+        <w:numPr>
+          <w:ilvl w:val="1"/>
+          <w:numId w:val="1"/>
+        </w:numPr>
+        <w:rPr>
+          <w:b/>
+          <w:bCs/>
+        </w:rPr>
+      </w:pPr>
+      <w:r>
+        <w:t>t</w:t>
+      </w:r>
+      <w:r>
+        <w:t>esting</w:t>
+      </w:r>
+      <w:r>
+        <w:t xml:space="preserve"> and resuming the game makes it run faster </w:t>
       </w:r>
     </w:p>
     <w:p>
@@ -595,7 +629,7 @@
         <w:rPr>
           <w:highlight w:val="green"/>
         </w:rPr>
-        <w:t xml:space="preserve">Currently the sphere does not collide with the obstacles. It should not move forward if it collides unless the user makes it smaller/bigger to fit through </w:t>
+        <w:t xml:space="preserve">The sphere collides now but it continues to move. </w:t>
       </w:r>
     </w:p>
     <w:p>
@@ -799,6 +833,7 @@
     <w:p/>
     <w:p>
       <w:r>
+        <w:lastRenderedPageBreak/>
         <w:t xml:space="preserve">AFTER ALL OF THIS IS DONE: AUDIO AND SOUND EFFECTS </w:t>
       </w:r>
     </w:p>
@@ -4503,6 +4538,7 @@
   <w:style w:type="character" w:default="1" w:styleId="DefaultParagraphFont">
     <w:name w:val="Default Paragraph Font"/>
     <w:uiPriority w:val="1"/>
+    <w:semiHidden/>
     <w:unhideWhenUsed/>
   </w:style>
   <w:style w:type="table" w:default="1" w:styleId="TableNormal">

</xml_diff>

<commit_message>
Updated sound system, fixed bugs, demo with terrain drop
</commit_message>
<xml_diff>
--- a/ImprovementsList.docx
+++ b/ImprovementsList.docx
@@ -23,17 +23,6 @@
       </w:r>
     </w:p>
     <w:p>
-      <w:r>
-        <w:rPr>
-          <w:highlight w:val="green"/>
-        </w:rPr>
-        <w:t>More pressing bugs are highlighted</w:t>
-      </w:r>
-      <w:r>
-        <w:t xml:space="preserve"> </w:t>
-      </w:r>
-    </w:p>
-    <w:p>
       <w:pPr>
         <w:rPr>
           <w:b/>
@@ -64,116 +53,6 @@
           <w:bCs/>
           <w:sz w:val="32"/>
           <w:szCs w:val="32"/>
-          <w:highlight w:val="green"/>
-        </w:rPr>
-      </w:pPr>
-      <w:r>
-        <w:rPr>
-          <w:highlight w:val="green"/>
-        </w:rPr>
-        <w:t>Obstacles</w:t>
-      </w:r>
-    </w:p>
-    <w:p>
-      <w:pPr>
-        <w:pStyle w:val="ListParagraph"/>
-        <w:numPr>
-          <w:ilvl w:val="1"/>
-          <w:numId w:val="1"/>
-        </w:numPr>
-        <w:rPr>
-          <w:b/>
-          <w:bCs/>
-          <w:sz w:val="32"/>
-          <w:szCs w:val="32"/>
-          <w:highlight w:val="green"/>
-        </w:rPr>
-      </w:pPr>
-      <w:r>
-        <w:rPr>
-          <w:highlight w:val="green"/>
-        </w:rPr>
-        <w:t xml:space="preserve">In the middle of the obstacle size of the sphere cannot change AT ALL </w:t>
-      </w:r>
-    </w:p>
-    <w:p>
-      <w:pPr>
-        <w:pStyle w:val="ListParagraph"/>
-        <w:numPr>
-          <w:ilvl w:val="1"/>
-          <w:numId w:val="1"/>
-        </w:numPr>
-        <w:rPr>
-          <w:b/>
-          <w:bCs/>
-          <w:sz w:val="32"/>
-          <w:szCs w:val="32"/>
-          <w:highlight w:val="green"/>
-        </w:rPr>
-      </w:pPr>
-      <w:r>
-        <w:rPr>
-          <w:highlight w:val="green"/>
-        </w:rPr>
-        <w:t xml:space="preserve">At the end of an obstacle an overlap can occur </w:t>
-      </w:r>
-    </w:p>
-    <w:p>
-      <w:pPr>
-        <w:pStyle w:val="ListParagraph"/>
-        <w:numPr>
-          <w:ilvl w:val="0"/>
-          <w:numId w:val="1"/>
-        </w:numPr>
-        <w:rPr>
-          <w:b/>
-          <w:bCs/>
-          <w:sz w:val="32"/>
-          <w:szCs w:val="32"/>
-          <w:highlight w:val="green"/>
-        </w:rPr>
-      </w:pPr>
-      <w:r>
-        <w:rPr>
-          <w:highlight w:val="green"/>
-        </w:rPr>
-        <w:t>Terrain step-up</w:t>
-      </w:r>
-    </w:p>
-    <w:p>
-      <w:pPr>
-        <w:pStyle w:val="ListParagraph"/>
-        <w:numPr>
-          <w:ilvl w:val="1"/>
-          <w:numId w:val="1"/>
-        </w:numPr>
-        <w:rPr>
-          <w:b/>
-          <w:bCs/>
-          <w:sz w:val="32"/>
-          <w:szCs w:val="32"/>
-          <w:highlight w:val="green"/>
-        </w:rPr>
-      </w:pPr>
-      <w:r>
-        <w:rPr>
-          <w:highlight w:val="green"/>
-        </w:rPr>
-        <w:t xml:space="preserve">Not restrictive to small balls </w:t>
-      </w:r>
-    </w:p>
-    <w:p>
-      <w:pPr>
-        <w:pStyle w:val="ListParagraph"/>
-        <w:numPr>
-          <w:ilvl w:val="0"/>
-          <w:numId w:val="1"/>
-        </w:numPr>
-        <w:rPr>
-          <w:b/>
-          <w:bCs/>
-          <w:sz w:val="32"/>
-          <w:szCs w:val="32"/>
         </w:rPr>
       </w:pPr>
       <w:r>
@@ -317,6 +196,18 @@
       <w:pPr>
         <w:pStyle w:val="ListParagraph"/>
         <w:numPr>
+          <w:ilvl w:val="2"/>
+          <w:numId w:val="1"/>
+        </w:numPr>
+      </w:pPr>
+      <w:r>
+        <w:t xml:space="preserve">DiamondCollected.wav </w:t>
+      </w:r>
+    </w:p>
+    <w:p>
+      <w:pPr>
+        <w:pStyle w:val="ListParagraph"/>
+        <w:numPr>
           <w:ilvl w:val="0"/>
           <w:numId w:val="1"/>
         </w:numPr>
@@ -329,6 +220,21 @@
       <w:pPr>
         <w:pStyle w:val="ListParagraph"/>
         <w:numPr>
+          <w:ilvl w:val="2"/>
+          <w:numId w:val="1"/>
+        </w:numPr>
+      </w:pPr>
+      <w:r>
+        <w:t xml:space="preserve">reference: </w:t>
+      </w:r>
+      <w:r>
+        <w:t>BackgroundMusic.wav</w:t>
+      </w:r>
+    </w:p>
+    <w:p>
+      <w:pPr>
+        <w:pStyle w:val="ListParagraph"/>
+        <w:numPr>
           <w:ilvl w:val="0"/>
           <w:numId w:val="1"/>
         </w:numPr>
@@ -346,13 +252,11 @@
         </w:numPr>
       </w:pPr>
       <w:r>
-        <w:t xml:space="preserve">reference: </w:t>
+        <w:t>reference: CongratulationSoun</w:t>
       </w:r>
-      <w:proofErr w:type="spellStart"/>
       <w:r>
-        <w:t>CongratulationSound</w:t>
+        <w:t>d.mp3</w:t>
       </w:r>
-      <w:proofErr w:type="spellEnd"/>
     </w:p>
     <w:sectPr>
       <w:pgSz w:w="12240" w:h="15840"/>

</xml_diff>

<commit_message>
New updated terrain and obstacles, less bugs, good sound
</commit_message>
<xml_diff>
--- a/ImprovementsList.docx
+++ b/ImprovementsList.docx
@@ -8,8 +8,8 @@
         <w:rPr>
           <w:b/>
           <w:bCs/>
-          <w:sz w:val="32"/>
-          <w:szCs w:val="32"/>
+          <w:sz w:val="36"/>
+          <w:szCs w:val="36"/>
         </w:rPr>
       </w:pPr>
       <w:r>
@@ -53,10 +53,80 @@
           <w:bCs/>
           <w:sz w:val="32"/>
           <w:szCs w:val="32"/>
+          <w:highlight w:val="green"/>
         </w:rPr>
       </w:pPr>
       <w:r>
+        <w:rPr>
+          <w:highlight w:val="green"/>
+        </w:rPr>
         <w:t xml:space="preserve">Terrain step down </w:t>
+      </w:r>
+    </w:p>
+    <w:p>
+      <w:pPr>
+        <w:pStyle w:val="ListParagraph"/>
+        <w:numPr>
+          <w:ilvl w:val="1"/>
+          <w:numId w:val="1"/>
+        </w:numPr>
+        <w:rPr>
+          <w:b/>
+          <w:bCs/>
+          <w:sz w:val="32"/>
+          <w:szCs w:val="32"/>
+          <w:highlight w:val="green"/>
+        </w:rPr>
+      </w:pPr>
+      <w:r>
+        <w:rPr>
+          <w:highlight w:val="green"/>
+        </w:rPr>
+        <w:t xml:space="preserve">Diamonds overlap </w:t>
+      </w:r>
+    </w:p>
+    <w:p>
+      <w:pPr>
+        <w:pStyle w:val="ListParagraph"/>
+        <w:numPr>
+          <w:ilvl w:val="1"/>
+          <w:numId w:val="1"/>
+        </w:numPr>
+        <w:rPr>
+          <w:b/>
+          <w:bCs/>
+          <w:sz w:val="32"/>
+          <w:szCs w:val="32"/>
+          <w:highlight w:val="green"/>
+        </w:rPr>
+      </w:pPr>
+      <w:r>
+        <w:rPr>
+          <w:highlight w:val="green"/>
+        </w:rPr>
+        <w:t xml:space="preserve">The step-up doesn’t always work. Its iffy. </w:t>
+      </w:r>
+    </w:p>
+    <w:p>
+      <w:pPr>
+        <w:pStyle w:val="ListParagraph"/>
+        <w:numPr>
+          <w:ilvl w:val="1"/>
+          <w:numId w:val="1"/>
+        </w:numPr>
+        <w:rPr>
+          <w:b/>
+          <w:bCs/>
+          <w:sz w:val="32"/>
+          <w:szCs w:val="32"/>
+          <w:highlight w:val="green"/>
+        </w:rPr>
+      </w:pPr>
+      <w:r>
+        <w:rPr>
+          <w:highlight w:val="green"/>
+        </w:rPr>
+        <w:t xml:space="preserve">There is a line between obstacles and terrain where it should just be white </w:t>
       </w:r>
     </w:p>
     <w:p>
@@ -66,6 +136,12 @@
           <w:ilvl w:val="0"/>
           <w:numId w:val="1"/>
         </w:numPr>
+        <w:rPr>
+          <w:b/>
+          <w:bCs/>
+          <w:sz w:val="32"/>
+          <w:szCs w:val="32"/>
+        </w:rPr>
       </w:pPr>
       <w:r>
         <w:t xml:space="preserve">Different types of obstacles </w:t>
@@ -92,19 +168,10 @@
         </w:numPr>
       </w:pPr>
       <w:r>
-        <w:t xml:space="preserve">hole-obstacle.png </w:t>
+        <w:t>maze</w:t>
       </w:r>
-    </w:p>
-    <w:p>
-      <w:pPr>
-        <w:pStyle w:val="ListParagraph"/>
-        <w:numPr>
-          <w:ilvl w:val="2"/>
-          <w:numId w:val="1"/>
-        </w:numPr>
-      </w:pPr>
       <w:r>
-        <w:t xml:space="preserve">maze-obstacle.png </w:t>
+        <w:t xml:space="preserve">-obstacle.png </w:t>
       </w:r>
     </w:p>
     <w:p>
@@ -147,115 +214,6 @@
       </w:pPr>
       <w:r>
         <w:t>encouragementgraphic.mp4</w:t>
-      </w:r>
-    </w:p>
-    <w:p>
-      <w:pPr>
-        <w:rPr>
-          <w:b/>
-          <w:bCs/>
-          <w:i/>
-          <w:iCs/>
-        </w:rPr>
-      </w:pPr>
-      <w:r>
-        <w:rPr>
-          <w:b/>
-          <w:bCs/>
-          <w:i/>
-          <w:iCs/>
-        </w:rPr>
-        <w:t xml:space="preserve">Audio and Sound effects: </w:t>
-      </w:r>
-    </w:p>
-    <w:p>
-      <w:pPr>
-        <w:pStyle w:val="ListParagraph"/>
-        <w:numPr>
-          <w:ilvl w:val="0"/>
-          <w:numId w:val="1"/>
-        </w:numPr>
-      </w:pPr>
-      <w:r>
-        <w:t xml:space="preserve">background music </w:t>
-      </w:r>
-    </w:p>
-    <w:p>
-      <w:pPr>
-        <w:pStyle w:val="ListParagraph"/>
-        <w:numPr>
-          <w:ilvl w:val="1"/>
-          <w:numId w:val="1"/>
-        </w:numPr>
-      </w:pPr>
-      <w:r>
-        <w:t>should be tuned down when the game is paused</w:t>
-      </w:r>
-    </w:p>
-    <w:p>
-      <w:pPr>
-        <w:pStyle w:val="ListParagraph"/>
-        <w:numPr>
-          <w:ilvl w:val="2"/>
-          <w:numId w:val="1"/>
-        </w:numPr>
-      </w:pPr>
-      <w:r>
-        <w:t xml:space="preserve">DiamondCollected.wav </w:t>
-      </w:r>
-    </w:p>
-    <w:p>
-      <w:pPr>
-        <w:pStyle w:val="ListParagraph"/>
-        <w:numPr>
-          <w:ilvl w:val="0"/>
-          <w:numId w:val="1"/>
-        </w:numPr>
-      </w:pPr>
-      <w:r>
-        <w:t>diamond collection sound</w:t>
-      </w:r>
-    </w:p>
-    <w:p>
-      <w:pPr>
-        <w:pStyle w:val="ListParagraph"/>
-        <w:numPr>
-          <w:ilvl w:val="2"/>
-          <w:numId w:val="1"/>
-        </w:numPr>
-      </w:pPr>
-      <w:r>
-        <w:t xml:space="preserve">reference: </w:t>
-      </w:r>
-      <w:r>
-        <w:t>BackgroundMusic.wav</w:t>
-      </w:r>
-    </w:p>
-    <w:p>
-      <w:pPr>
-        <w:pStyle w:val="ListParagraph"/>
-        <w:numPr>
-          <w:ilvl w:val="0"/>
-          <w:numId w:val="1"/>
-        </w:numPr>
-      </w:pPr>
-      <w:r>
-        <w:t xml:space="preserve">encouragement blob celebratory sound </w:t>
-      </w:r>
-    </w:p>
-    <w:p>
-      <w:pPr>
-        <w:pStyle w:val="ListParagraph"/>
-        <w:numPr>
-          <w:ilvl w:val="2"/>
-          <w:numId w:val="1"/>
-        </w:numPr>
-      </w:pPr>
-      <w:r>
-        <w:t>reference: CongratulationSoun</w:t>
-      </w:r>
-      <w:r>
-        <w:t>d.mp3</w:t>
       </w:r>
     </w:p>
     <w:sectPr>

</xml_diff>

<commit_message>
Update on encouragement event, hole obstacle, and fixed bugs.
</commit_message>
<xml_diff>
--- a/ImprovementsList.docx
+++ b/ImprovementsList.docx
@@ -82,7 +82,7 @@
         <w:rPr>
           <w:highlight w:val="green"/>
         </w:rPr>
-        <w:t xml:space="preserve">Diamonds overlap </w:t>
+        <w:t>Diamonds overlap</w:t>
       </w:r>
     </w:p>
     <w:p>
@@ -104,7 +104,7 @@
         <w:rPr>
           <w:highlight w:val="green"/>
         </w:rPr>
-        <w:t xml:space="preserve">The step-up doesn’t always work. Its iffy. </w:t>
+        <w:t>The step-up doesn’t always work. Its iffy</w:t>
       </w:r>
     </w:p>
     <w:p>
@@ -126,7 +126,7 @@
         <w:rPr>
           <w:highlight w:val="green"/>
         </w:rPr>
-        <w:t xml:space="preserve">There is a line between obstacles and terrain where it should just be white </w:t>
+        <w:t xml:space="preserve">Make the sphere non-floaty </w:t>
       </w:r>
     </w:p>
     <w:p>
@@ -172,48 +172,6 @@
       </w:r>
       <w:r>
         <w:t xml:space="preserve">-obstacle.png </w:t>
-      </w:r>
-    </w:p>
-    <w:p>
-      <w:pPr>
-        <w:pStyle w:val="ListParagraph"/>
-        <w:numPr>
-          <w:ilvl w:val="0"/>
-          <w:numId w:val="1"/>
-        </w:numPr>
-      </w:pPr>
-      <w:r>
-        <w:t xml:space="preserve">“Sort of level up” </w:t>
-      </w:r>
-    </w:p>
-    <w:p>
-      <w:pPr>
-        <w:pStyle w:val="ListParagraph"/>
-        <w:numPr>
-          <w:ilvl w:val="1"/>
-          <w:numId w:val="1"/>
-        </w:numPr>
-      </w:pPr>
-      <w:r>
-        <w:t>T</w:t>
-      </w:r>
-      <w:r>
-        <w:t xml:space="preserve">he dissolving wall is yet to be added </w:t>
-      </w:r>
-      <w:r>
-        <w:t xml:space="preserve"> </w:t>
-      </w:r>
-    </w:p>
-    <w:p>
-      <w:pPr>
-        <w:pStyle w:val="ListParagraph"/>
-        <w:numPr>
-          <w:ilvl w:val="2"/>
-          <w:numId w:val="1"/>
-        </w:numPr>
-      </w:pPr>
-      <w:r>
-        <w:t>encouragementgraphic.mp4</w:t>
       </w:r>
     </w:p>
     <w:sectPr>

</xml_diff>